<commit_message>
Reformat resume to Google-style single-column layout (serif, blue accents, tech-stack lines)
</commit_message>
<xml_diff>
--- a/Sweta_Guha_Thakurta_Senior_Salesforce_Developer.docx
+++ b/Sweta_Guha_Thakurta_Senior_Salesforce_Developer.docx
@@ -2,20 +2,6 @@
 <file path=word/document.xml><?xml version="1.0" encoding="utf-8"?>
 <w:document xmlns:wpc="http://schemas.microsoft.com/office/word/2010/wordprocessingCanvas" xmlns:mo="http://schemas.microsoft.com/office/mac/office/2008/main" xmlns:mc="http://schemas.openxmlformats.org/markup-compatibility/2006" xmlns:mv="urn:schemas-microsoft-com:mac:vml" xmlns:o="urn:schemas-microsoft-com:office:office" xmlns:r="http://schemas.openxmlformats.org/officeDocument/2006/relationships" xmlns:m="http://schemas.openxmlformats.org/officeDocument/2006/math" xmlns:v="urn:schemas-microsoft-com:vml" xmlns:wp14="http://schemas.microsoft.com/office/word/2010/wordprocessingDrawing" xmlns:wp="http://schemas.openxmlformats.org/drawingml/2006/wordprocessingDrawing" xmlns:w10="urn:schemas-microsoft-com:office:word" xmlns:w="http://schemas.openxmlformats.org/wordprocessingml/2006/main" xmlns:w14="http://schemas.microsoft.com/office/word/2010/wordml" xmlns:wpg="http://schemas.microsoft.com/office/word/2010/wordprocessingGroup" xmlns:wpi="http://schemas.microsoft.com/office/word/2010/wordprocessingInk" xmlns:wne="http://schemas.microsoft.com/office/word/2006/wordml" xmlns:wps="http://schemas.microsoft.com/office/word/2010/wordprocessingShape" mc:Ignorable="w14 wp14">
   <w:body>
-    <w:p>
-      <w:pPr>
-        <w:spacing w:after="0"/>
-        <w:jc w:val="center"/>
-      </w:pPr>
-      <w:r>
-        <w:rPr>
-          <w:b/>
-          <w:color w:val="1F3A5F"/>
-          <w:sz w:val="40"/>
-        </w:rPr>
-        <w:t>SWETA GUHA THAKURTA</w:t>
-      </w:r>
-    </w:p>
     <w:p>
       <w:pPr>
         <w:spacing w:after="40"/>
@@ -23,11 +9,11 @@
       </w:pPr>
       <w:r>
         <w:rPr>
-          <w:b/>
-          <w:color w:val="222222"/>
-          <w:sz w:val="23"/>
+          <w:b w:val="0"/>
+          <w:color w:val="000000"/>
+          <w:sz w:val="48"/>
         </w:rPr>
-        <w:t>Senior Salesforce Developer</w:t>
+        <w:t>SWETA GUHA THAKURTA</w:t>
       </w:r>
     </w:p>
     <w:p>
@@ -37,61 +23,65 @@
       </w:pPr>
       <w:r>
         <w:rPr>
-          <w:sz w:val="19"/>
+          <w:color w:val="204A87"/>
+          <w:sz w:val="20"/>
         </w:rPr>
-        <w:t>Bangalore, Karnataka, India  |  +91 9836781255  |  swetagt96@gmail.com</w:t>
+        <w:t>swetagt96@gmail.com</w:t>
+      </w:r>
+      <w:r>
+        <w:rPr>
+          <w:sz w:val="20"/>
+        </w:rPr>
+        <w:t xml:space="preserve">  |  </w:t>
+      </w:r>
+      <w:r>
+        <w:rPr>
+          <w:color w:val="204A87"/>
+          <w:sz w:val="20"/>
+        </w:rPr>
+        <w:t>+91 9836781255</w:t>
       </w:r>
     </w:p>
     <w:p>
       <w:pPr>
-        <w:spacing w:after="0"/>
+        <w:spacing w:after="80"/>
         <w:jc w:val="center"/>
       </w:pPr>
       <w:r>
         <w:rPr>
-          <w:sz w:val="19"/>
+          <w:color w:val="204A87"/>
+          <w:sz w:val="20"/>
         </w:rPr>
-        <w:t>linkedin.com/in/sweta-03b8b7122  |  salesforce.com/trailblazer/swetagt96</w:t>
+        <w:t>linkedin.com/in/sweta-03b8b7122</w:t>
+      </w:r>
+      <w:r>
+        <w:rPr>
+          <w:sz w:val="20"/>
+        </w:rPr>
+        <w:t xml:space="preserve">  |  </w:t>
+      </w:r>
+      <w:r>
+        <w:rPr>
+          <w:color w:val="204A87"/>
+          <w:sz w:val="20"/>
+        </w:rPr>
+        <w:t>salesforce.com/trailblazer/swetagt96</w:t>
       </w:r>
     </w:p>
     <w:p>
       <w:pPr>
-        <w:spacing w:before="160" w:after="40"/>
+        <w:spacing w:before="160" w:after="20"/>
         <w:pBdr>
-          <w:bottom w:val="single" w:sz="6" w:space="1" w:color="1F3A5F"/>
+          <w:bottom w:val="single" w:sz="6" w:space="2" w:color="000000"/>
         </w:pBdr>
       </w:pPr>
       <w:r>
         <w:rPr>
           <w:b/>
-          <w:color w:val="1F3A5F"/>
-          <w:sz w:val="23"/>
+          <w:color w:val="000000"/>
+          <w:sz w:val="27"/>
         </w:rPr>
-        <w:t>SUMMARY</w:t>
-      </w:r>
-    </w:p>
-    <w:p>
-      <w:pPr>
-        <w:spacing w:after="40"/>
-      </w:pPr>
-      <w:r>
-        <w:t>Senior Salesforce Developer with 7+ years delivering high-scale, customer-facing platforms and enterprise integrations across automotive, consulting, and pharma. Proven record of owning systems end-to-end — from a 10,000-user single sign-on portal to a 99.8%-uptime cross-org sync framework processing 10,000 transactions/day — and pioneering AI features with Salesforce Agentforce and Prompt Builder. Trusted to translate ambiguous business needs into resilient, secure technical architecture while partnering across engineering, operations, and global stakeholders.</w:t>
-      </w:r>
-    </w:p>
-    <w:p>
-      <w:pPr>
-        <w:spacing w:before="160" w:after="40"/>
-        <w:pBdr>
-          <w:bottom w:val="single" w:sz="6" w:space="1" w:color="1F3A5F"/>
-        </w:pBdr>
-      </w:pPr>
-      <w:r>
-        <w:rPr>
-          <w:b/>
-          <w:color w:val="1F3A5F"/>
-          <w:sz w:val="23"/>
-        </w:rPr>
-        <w:t>CORE SKILLS</w:t>
+        <w:t>Skills</w:t>
       </w:r>
     </w:p>
     <w:p>
@@ -101,11 +91,15 @@
       <w:r>
         <w:rPr>
           <w:b/>
+          <w:sz w:val="21"/>
         </w:rPr>
-        <w:t xml:space="preserve">Languages &amp; Frameworks: </w:t>
+        <w:t xml:space="preserve">Languages: </w:t>
       </w:r>
       <w:r>
-        <w:t>Apex, Lightning Web Components (LWC), Aura, Visualforce, JavaScript (ES6+), SOQL, SOSL, HTML/CSS, SLDS</w:t>
+        <w:rPr>
+          <w:sz w:val="21"/>
+        </w:rPr>
+        <w:t>Apex, JavaScript (ES6+), SOQL, SOSL, Visualforce, HTML, CSS</w:t>
       </w:r>
     </w:p>
     <w:p>
@@ -115,11 +109,15 @@
       <w:r>
         <w:rPr>
           <w:b/>
+          <w:sz w:val="21"/>
         </w:rPr>
-        <w:t xml:space="preserve">Async &amp; Automation: </w:t>
+        <w:t xml:space="preserve">Salesforce: </w:t>
       </w:r>
       <w:r>
-        <w:t>Batch Apex, Queueable Apex, Scheduled Apex, Platform Events, Flows, Approval Processes, Validation Rules</w:t>
+        <w:rPr>
+          <w:sz w:val="21"/>
+        </w:rPr>
+        <w:t>Lightning Web Components (LWC), Aura, Flows, Triggers, Batch / Queueable / Scheduled Apex, Platform Events, Agentforce, Prompt Builder, Einstein AI, Sales Cloud, Experience Cloud, Commerce Cloud, CRM Analytics</w:t>
       </w:r>
     </w:p>
     <w:p>
@@ -129,11 +127,386 @@
       <w:r>
         <w:rPr>
           <w:b/>
+          <w:sz w:val="21"/>
         </w:rPr>
-        <w:t xml:space="preserve">Integration: </w:t>
+        <w:t xml:space="preserve">Tools &amp; Integration: </w:t>
       </w:r>
       <w:r>
-        <w:t>REST &amp; SOAP APIs, Named Credentials, OAuth 2.0, Bulk API, Composite API, MuleSoft, cross-org / cross-instance integration patterns, Postman</w:t>
+        <w:rPr>
+          <w:sz w:val="21"/>
+        </w:rPr>
+        <w:t>REST / SOAP APIs, Named Credentials, OAuth 2.0, MuleSoft, cross-org integration patterns, Salesforce DX, GitLab, Azure DevOps, DevOps Center, Copado, CI/CD, Data Loader, Workbench, Postman, Agile Scrum</w:t>
+      </w:r>
+    </w:p>
+    <w:p>
+      <w:pPr>
+        <w:spacing w:before="160" w:after="20"/>
+        <w:pBdr>
+          <w:bottom w:val="single" w:sz="6" w:space="2" w:color="000000"/>
+        </w:pBdr>
+      </w:pPr>
+      <w:r>
+        <w:rPr>
+          <w:b/>
+          <w:color w:val="000000"/>
+          <w:sz w:val="27"/>
+        </w:rPr>
+        <w:t>Work Experience</w:t>
+      </w:r>
+    </w:p>
+    <w:p>
+      <w:pPr>
+        <w:tabs>
+          <w:tab w:pos="9936" w:val="right"/>
+        </w:tabs>
+        <w:spacing w:before="100" w:after="0"/>
+      </w:pPr>
+      <w:r>
+        <w:rPr>
+          <w:b/>
+          <w:sz w:val="21"/>
+        </w:rPr>
+        <w:t>Volvo Group India Pvt. Ltd., Bangalore</w:t>
+      </w:r>
+      <w:r>
+        <w:rPr>
+          <w:i/>
+          <w:color w:val="204A87"/>
+          <w:sz w:val="21"/>
+        </w:rPr>
+        <w:tab/>
+        <w:t>Sep 2024 - Present</w:t>
+      </w:r>
+    </w:p>
+    <w:p>
+      <w:pPr>
+        <w:spacing w:after="20"/>
+      </w:pPr>
+      <w:r>
+        <w:rPr>
+          <w:i/>
+          <w:color w:val="204A87"/>
+          <w:sz w:val="21"/>
+        </w:rPr>
+        <w:t>Senior Salesforce Developer</w:t>
+      </w:r>
+    </w:p>
+    <w:p>
+      <w:pPr>
+        <w:pStyle w:val="ListBullet"/>
+        <w:spacing w:after="30" w:line="250" w:lineRule="auto"/>
+      </w:pPr>
+      <w:r>
+        <w:rPr>
+          <w:sz w:val="21"/>
+        </w:rPr>
+        <w:t>Architected and shipped the Control Center single sign-on portal from scratch, unifying Customer Portal, Service Marketplace, Parts, and Aftermarket apps into one login serving 10,000+ dealers and customers globally and eliminating multi-system login friction.</w:t>
+      </w:r>
+    </w:p>
+    <w:p>
+      <w:pPr>
+        <w:pStyle w:val="ListBullet"/>
+        <w:spacing w:after="30" w:line="250" w:lineRule="auto"/>
+      </w:pPr>
+      <w:r>
+        <w:rPr>
+          <w:sz w:val="21"/>
+        </w:rPr>
+        <w:t>Independently built an AI-powered Account Insights agent using Salesforce Agentforce and Prompt Builder, auto-summarizing 10 critical account dimensions (segmentation, hierarchy, contracts, vehicle data, service-market insights) and sharply reducing manual account-research time for sales reps.</w:t>
+      </w:r>
+    </w:p>
+    <w:p>
+      <w:pPr>
+        <w:pStyle w:val="ListBullet"/>
+        <w:spacing w:after="30" w:line="250" w:lineRule="auto"/>
+      </w:pPr>
+      <w:r>
+        <w:rPr>
+          <w:sz w:val="21"/>
+        </w:rPr>
+        <w:t>Delivered 25+ production LWC, Apex, Trigger, and Platform Event components at 90% test coverage, reducing post-release defects and enabling reliable, rollback-free CRM deployments.</w:t>
+      </w:r>
+    </w:p>
+    <w:p>
+      <w:pPr>
+        <w:pStyle w:val="ListBullet"/>
+        <w:spacing w:after="30" w:line="250" w:lineRule="auto"/>
+      </w:pPr>
+      <w:r>
+        <w:rPr>
+          <w:sz w:val="21"/>
+        </w:rPr>
+        <w:t>Drove the Volvo Trucks CRM launch across 40 global regions, owning data migration, security configuration, user access, and release activities to deliver an on-time go-live with zero critical launch defects.</w:t>
+      </w:r>
+    </w:p>
+    <w:p>
+      <w:pPr>
+        <w:pStyle w:val="ListBullet"/>
+        <w:spacing w:after="30" w:line="250" w:lineRule="auto"/>
+      </w:pPr>
+      <w:r>
+        <w:rPr>
+          <w:sz w:val="21"/>
+        </w:rPr>
+        <w:t>Designed a reusable Apex framework and shared utility library, standardizing logic across 25+ components and accelerating delivery of new features within sprint timelines.</w:t>
+      </w:r>
+    </w:p>
+    <w:p>
+      <w:pPr>
+        <w:pStyle w:val="ListBullet"/>
+        <w:spacing w:after="30" w:line="250" w:lineRule="auto"/>
+      </w:pPr>
+      <w:r>
+        <w:rPr>
+          <w:b w:val="0"/>
+          <w:i/>
+          <w:sz w:val="21"/>
+        </w:rPr>
+        <w:t xml:space="preserve">Tools &amp; Tech: </w:t>
+      </w:r>
+      <w:r>
+        <w:rPr>
+          <w:sz w:val="21"/>
+        </w:rPr>
+        <w:t>LWC, Apex, Triggers, Platform Events, Flows, Agentforce, Prompt Builder, VS Code, GitLab, DevOps Center, Azure DevOps, Postman</w:t>
+      </w:r>
+    </w:p>
+    <w:p>
+      <w:pPr>
+        <w:tabs>
+          <w:tab w:pos="9936" w:val="right"/>
+        </w:tabs>
+        <w:spacing w:before="100" w:after="0"/>
+      </w:pPr>
+      <w:r>
+        <w:rPr>
+          <w:b/>
+          <w:sz w:val="21"/>
+        </w:rPr>
+        <w:t>Accenture Solutions Pvt. Ltd., Bangalore</w:t>
+      </w:r>
+      <w:r>
+        <w:rPr>
+          <w:i/>
+          <w:color w:val="204A87"/>
+          <w:sz w:val="21"/>
+        </w:rPr>
+        <w:tab/>
+        <w:t>Apr 2022 - Sep 2024</w:t>
+      </w:r>
+    </w:p>
+    <w:p>
+      <w:pPr>
+        <w:spacing w:after="20"/>
+      </w:pPr>
+      <w:r>
+        <w:rPr>
+          <w:i/>
+          <w:color w:val="204A87"/>
+          <w:sz w:val="21"/>
+        </w:rPr>
+        <w:t>Salesforce Developer</w:t>
+      </w:r>
+    </w:p>
+    <w:p>
+      <w:pPr>
+        <w:pStyle w:val="ListBullet"/>
+        <w:spacing w:after="30" w:line="250" w:lineRule="auto"/>
+      </w:pPr>
+      <w:r>
+        <w:rPr>
+          <w:sz w:val="21"/>
+        </w:rPr>
+        <w:t>Engineered a reusable Apex REST framework for real-time cross-org data synchronization, sustaining 99.8% uptime over 24 months and 10,000 transactions/day across 3 Salesforce environments.</w:t>
+      </w:r>
+    </w:p>
+    <w:p>
+      <w:pPr>
+        <w:pStyle w:val="ListBullet"/>
+        <w:spacing w:after="30" w:line="250" w:lineRule="auto"/>
+      </w:pPr>
+      <w:r>
+        <w:rPr>
+          <w:sz w:val="21"/>
+        </w:rPr>
+        <w:t>Delivered 12+ LWC, Aura, Apex, Batch, and REST components at 90%+ test coverage, simplifying complex business processes and improving end-user experience.</w:t>
+      </w:r>
+    </w:p>
+    <w:p>
+      <w:pPr>
+        <w:pStyle w:val="ListBullet"/>
+        <w:spacing w:after="30" w:line="250" w:lineRule="auto"/>
+      </w:pPr>
+      <w:r>
+        <w:rPr>
+          <w:sz w:val="21"/>
+        </w:rPr>
+        <w:t>Led development of a Google Maps-integrated Lightning feature surfacing store locations, sales performance, and pricing, giving field teams real-time geographic visibility into client performance.</w:t>
+      </w:r>
+    </w:p>
+    <w:p>
+      <w:pPr>
+        <w:pStyle w:val="ListBullet"/>
+        <w:spacing w:after="30" w:line="250" w:lineRule="auto"/>
+      </w:pPr>
+      <w:r>
+        <w:rPr>
+          <w:sz w:val="21"/>
+        </w:rPr>
+        <w:t>Built automation frameworks with Batch Apex, Flows, and asynchronous processing, cutting manual processing effort by ~40% and improving operational throughput.</w:t>
+      </w:r>
+    </w:p>
+    <w:p>
+      <w:pPr>
+        <w:pStyle w:val="ListBullet"/>
+        <w:spacing w:after="30" w:line="250" w:lineRule="auto"/>
+      </w:pPr>
+      <w:r>
+        <w:rPr>
+          <w:sz w:val="21"/>
+        </w:rPr>
+        <w:t>Delivered 3 enterprise REST API integrations including a PCI-conscious payment gateway, enabling secure real-time transaction processing.</w:t>
+      </w:r>
+    </w:p>
+    <w:p>
+      <w:pPr>
+        <w:pStyle w:val="ListBullet"/>
+        <w:spacing w:after="30" w:line="250" w:lineRule="auto"/>
+      </w:pPr>
+      <w:r>
+        <w:rPr>
+          <w:b w:val="0"/>
+          <w:i/>
+          <w:sz w:val="21"/>
+        </w:rPr>
+        <w:t xml:space="preserve">Tools &amp; Tech: </w:t>
+      </w:r>
+      <w:r>
+        <w:rPr>
+          <w:sz w:val="21"/>
+        </w:rPr>
+        <w:t>LWC, Aura, Apex, Batch Apex, REST APIs, Visualforce, GitLab, CI/CD, Postman</w:t>
+      </w:r>
+    </w:p>
+    <w:p>
+      <w:pPr>
+        <w:tabs>
+          <w:tab w:pos="9936" w:val="right"/>
+        </w:tabs>
+        <w:spacing w:before="100" w:after="0"/>
+      </w:pPr>
+      <w:r>
+        <w:rPr>
+          <w:b/>
+          <w:sz w:val="21"/>
+        </w:rPr>
+        <w:t>Wipro Ltd., Bangalore</w:t>
+      </w:r>
+      <w:r>
+        <w:rPr>
+          <w:i/>
+          <w:color w:val="204A87"/>
+          <w:sz w:val="21"/>
+        </w:rPr>
+        <w:tab/>
+        <w:t>Jun 2019 - Apr 2022</w:t>
+      </w:r>
+    </w:p>
+    <w:p>
+      <w:pPr>
+        <w:spacing w:after="20"/>
+      </w:pPr>
+      <w:r>
+        <w:rPr>
+          <w:i/>
+          <w:color w:val="204A87"/>
+          <w:sz w:val="21"/>
+        </w:rPr>
+        <w:t>Salesforce Developer</w:t>
+      </w:r>
+    </w:p>
+    <w:p>
+      <w:pPr>
+        <w:pStyle w:val="ListBullet"/>
+        <w:spacing w:after="30" w:line="250" w:lineRule="auto"/>
+      </w:pPr>
+      <w:r>
+        <w:rPr>
+          <w:sz w:val="21"/>
+        </w:rPr>
+        <w:t>Built an Order Management &amp; Discounting module in Sales Cloud for a pharmaceutical client, supporting order-processing workflows for 1,000+ sales users.</w:t>
+      </w:r>
+    </w:p>
+    <w:p>
+      <w:pPr>
+        <w:pStyle w:val="ListBullet"/>
+        <w:spacing w:after="30" w:line="250" w:lineRule="auto"/>
+      </w:pPr>
+      <w:r>
+        <w:rPr>
+          <w:sz w:val="21"/>
+        </w:rPr>
+        <w:t>Developed Salesforce solutions using Visualforce, Apex, Triggers, Workflow Rules, and Approval Processes, automating business processes and reducing manual effort by ~40%.</w:t>
+      </w:r>
+    </w:p>
+    <w:p>
+      <w:pPr>
+        <w:pStyle w:val="ListBullet"/>
+        <w:spacing w:after="30" w:line="250" w:lineRule="auto"/>
+      </w:pPr>
+      <w:r>
+        <w:rPr>
+          <w:sz w:val="21"/>
+        </w:rPr>
+        <w:t>Designed 20+ reports and 15+ interactive dashboards (Matrix, Joined, gauges, charts), giving stakeholders self-serve visibility into sales performance.</w:t>
+      </w:r>
+    </w:p>
+    <w:p>
+      <w:pPr>
+        <w:pStyle w:val="ListBullet"/>
+        <w:spacing w:after="30" w:line="250" w:lineRule="auto"/>
+      </w:pPr>
+      <w:r>
+        <w:rPr>
+          <w:sz w:val="21"/>
+        </w:rPr>
+        <w:t>Optimized application performance through governor-limit management and secure coding practices, and managed deployments achieving releases with zero critical deployment failures.</w:t>
+      </w:r>
+    </w:p>
+    <w:p>
+      <w:pPr>
+        <w:pStyle w:val="ListBullet"/>
+        <w:spacing w:after="30" w:line="250" w:lineRule="auto"/>
+      </w:pPr>
+      <w:r>
+        <w:rPr>
+          <w:b w:val="0"/>
+          <w:i/>
+          <w:sz w:val="21"/>
+        </w:rPr>
+        <w:t xml:space="preserve">Tools &amp; Tech: </w:t>
+      </w:r>
+      <w:r>
+        <w:rPr>
+          <w:sz w:val="21"/>
+        </w:rPr>
+        <w:t>Visualforce, Apex, Triggers, Workflow Rules, Approval Processes, Workbench, ANT Migration Tool, Data Loader</w:t>
+      </w:r>
+    </w:p>
+    <w:p>
+      <w:pPr>
+        <w:spacing w:before="160" w:after="20"/>
+        <w:pBdr>
+          <w:bottom w:val="single" w:sz="6" w:space="2" w:color="000000"/>
+        </w:pBdr>
+      </w:pPr>
+      <w:r>
+        <w:rPr>
+          <w:b/>
+          <w:color w:val="000000"/>
+          <w:sz w:val="27"/>
+        </w:rPr>
+        <w:t>Certifications</w:t>
       </w:r>
     </w:p>
     <w:p>
@@ -142,104 +515,49 @@
       </w:pPr>
       <w:r>
         <w:rPr>
-          <w:b/>
+          <w:sz w:val="21"/>
         </w:rPr>
-        <w:t xml:space="preserve">Clouds &amp; AI: </w:t>
-      </w:r>
-      <w:r>
-        <w:t>Sales Cloud, Experience Cloud, Commerce Cloud, CRM Analytics, Salesforce Agentforce, Prompt Builder, Einstein AI</w:t>
+        <w:t>Salesforce Certified AI Specialist  -  Salesforce Certified AI Associate  -  Salesforce Certified Platform Developer I  -  Salesforce Certified Platform App Builder  -  Salesforce Certified Administrator  -  Copado Fundamentals</w:t>
       </w:r>
     </w:p>
     <w:p>
       <w:pPr>
-        <w:spacing w:after="40"/>
-      </w:pPr>
-      <w:r>
-        <w:rPr>
-          <w:b/>
-        </w:rPr>
-        <w:t xml:space="preserve">DevOps &amp; Release: </w:t>
-      </w:r>
-      <w:r>
-        <w:t>Salesforce DX (SFDX CLI), DevOps Center, GitLab, Azure DevOps, Copado, CI/CD, Data Loader, Workbench, ANT Migration Tool</w:t>
-      </w:r>
-    </w:p>
-    <w:p>
-      <w:pPr>
-        <w:spacing w:after="40"/>
-      </w:pPr>
-      <w:r>
-        <w:rPr>
-          <w:b/>
-        </w:rPr>
-        <w:t xml:space="preserve">Practices: </w:t>
-      </w:r>
-      <w:r>
-        <w:t>Application &amp; data modeling, governor-limit optimization, security &amp; sharing model design, Agile Scrum, stakeholder management</w:t>
-      </w:r>
-    </w:p>
-    <w:p>
-      <w:pPr>
-        <w:spacing w:before="160" w:after="40"/>
+        <w:spacing w:before="160" w:after="20"/>
         <w:pBdr>
-          <w:bottom w:val="single" w:sz="6" w:space="1" w:color="1F3A5F"/>
+          <w:bottom w:val="single" w:sz="6" w:space="2" w:color="000000"/>
         </w:pBdr>
       </w:pPr>
       <w:r>
         <w:rPr>
           <w:b/>
-          <w:color w:val="1F3A5F"/>
-          <w:sz w:val="23"/>
+          <w:color w:val="000000"/>
+          <w:sz w:val="27"/>
         </w:rPr>
-        <w:t>CERTIFICATIONS</w:t>
-      </w:r>
-    </w:p>
-    <w:p>
-      <w:pPr>
-        <w:spacing w:after="40"/>
-      </w:pPr>
-      <w:r>
-        <w:t>Salesforce Certified AI Specialist  •  Salesforce Certified AI Associate  •  Salesforce Certified Platform Developer I  •  Salesforce Certified Platform App Builder  •  Salesforce Certified Administrator  •  Copado Fundamentals</w:t>
-      </w:r>
-    </w:p>
-    <w:p>
-      <w:pPr>
-        <w:spacing w:before="160" w:after="40"/>
-        <w:pBdr>
-          <w:bottom w:val="single" w:sz="6" w:space="1" w:color="1F3A5F"/>
-        </w:pBdr>
-      </w:pPr>
-      <w:r>
-        <w:rPr>
-          <w:b/>
-          <w:color w:val="1F3A5F"/>
-          <w:sz w:val="23"/>
-        </w:rPr>
-        <w:t>PROFESSIONAL EXPERIENCE</w:t>
+        <w:t>Education</w:t>
       </w:r>
     </w:p>
     <w:p>
       <w:pPr>
         <w:tabs>
-          <w:tab w:pos="10080" w:val="right"/>
+          <w:tab w:pos="9936" w:val="right"/>
         </w:tabs>
-        <w:spacing w:before="120" w:after="0"/>
+        <w:spacing w:before="60" w:after="0"/>
       </w:pPr>
       <w:r>
         <w:rPr>
           <w:b/>
-          <w:color w:val="222222"/>
-          <w:sz w:val="22"/>
+          <w:sz w:val="21"/>
         </w:rPr>
-        <w:t>Senior Salesforce Developer, Volvo Group India Pvt. Ltd.</w:t>
+        <w:t>Institute of Engineering and Management, Kolkata</w:t>
       </w:r>
       <w:r>
         <w:rPr>
           <w:i/>
-          <w:sz w:val="19"/>
+          <w:color w:val="204A87"/>
+          <w:sz w:val="21"/>
         </w:rPr>
         <w:tab/>
-        <w:t>Sep 2024 – Present</w:t>
+        <w:t>2019</w:t>
       </w:r>
     </w:p>
     <w:p>
@@ -249,263 +567,15 @@
       <w:r>
         <w:rPr>
           <w:i/>
-          <w:color w:val="555555"/>
-          <w:sz w:val="19"/>
-        </w:rPr>
-        <w:t>Bangalore, India</w:t>
-      </w:r>
-    </w:p>
-    <w:p>
-      <w:pPr>
-        <w:pStyle w:val="ListBullet"/>
-        <w:spacing w:after="40" w:line="252" w:lineRule="auto"/>
-      </w:pPr>
-      <w:r>
-        <w:t>Architected and shipped the Control Center SSO portal from scratch, unifying Customer Portal, Service Marketplace, Parts, and Aftermarket apps into one login — serving 10,000+ dealers and customers across global markets and eliminating multi-system login friction.</w:t>
-      </w:r>
-    </w:p>
-    <w:p>
-      <w:pPr>
-        <w:pStyle w:val="ListBullet"/>
-        <w:spacing w:after="40" w:line="252" w:lineRule="auto"/>
-      </w:pPr>
-      <w:r>
-        <w:t>Independently built an AI-powered Account Insights agent using Salesforce Agentforce and Prompt Builder, auto-summarizing 10 critical account dimensions (segmentation, hierarchy, contracts, vehicle data, service-market insights) — sharply reducing manual account-research time for sales reps.</w:t>
-      </w:r>
-    </w:p>
-    <w:p>
-      <w:pPr>
-        <w:pStyle w:val="ListBullet"/>
-        <w:spacing w:after="40" w:line="252" w:lineRule="auto"/>
-      </w:pPr>
-      <w:r>
-        <w:t>Delivered 25+ production LWC, Apex, Trigger, and Platform Event components at 90% test coverage, reducing post-release defects and enabling reliable, rollback-free CRM deployments.</w:t>
-      </w:r>
-    </w:p>
-    <w:p>
-      <w:pPr>
-        <w:pStyle w:val="ListBullet"/>
-        <w:spacing w:after="40" w:line="252" w:lineRule="auto"/>
-      </w:pPr>
-      <w:r>
-        <w:t>Drove the Volvo Trucks CRM launch across 40 global regions — owning data migration, security configuration, user access, and release activities — delivering an on-time go-live with zero critical launch defects.</w:t>
-      </w:r>
-    </w:p>
-    <w:p>
-      <w:pPr>
-        <w:pStyle w:val="ListBullet"/>
-        <w:spacing w:after="40" w:line="252" w:lineRule="auto"/>
-      </w:pPr>
-      <w:r>
-        <w:t>Designed a reusable Apex framework and shared utility library, standardizing logic across 25+ components, reducing duplicate code, and accelerating delivery of new features within sprint timelines.</w:t>
-      </w:r>
-    </w:p>
-    <w:p>
-      <w:pPr>
-        <w:pStyle w:val="ListBullet"/>
-        <w:spacing w:after="40" w:line="252" w:lineRule="auto"/>
-      </w:pPr>
-      <w:r>
-        <w:t>Hardened platform security by designing role-based access via profiles, permission sets, sharing rules, and sharing sets — ensuring compliant, least-privilege data access for 10,000+ users.</w:t>
-      </w:r>
-    </w:p>
-    <w:p>
-      <w:pPr>
-        <w:tabs>
-          <w:tab w:pos="10080" w:val="right"/>
-        </w:tabs>
-        <w:spacing w:before="120" w:after="0"/>
-      </w:pPr>
-      <w:r>
-        <w:rPr>
-          <w:b/>
-          <w:color w:val="222222"/>
-          <w:sz w:val="22"/>
-        </w:rPr>
-        <w:t>Salesforce Developer, Accenture Solutions Pvt. Ltd.</w:t>
-      </w:r>
-      <w:r>
-        <w:rPr>
-          <w:i/>
-          <w:sz w:val="19"/>
-        </w:rPr>
-        <w:tab/>
-        <w:t>Apr 2022 – Sep 2024</w:t>
-      </w:r>
-    </w:p>
-    <w:p>
-      <w:pPr>
-        <w:spacing w:after="40"/>
-      </w:pPr>
-      <w:r>
-        <w:rPr>
-          <w:i/>
-          <w:color w:val="555555"/>
-          <w:sz w:val="19"/>
-        </w:rPr>
-        <w:t>Bangalore, India</w:t>
-      </w:r>
-    </w:p>
-    <w:p>
-      <w:pPr>
-        <w:pStyle w:val="ListBullet"/>
-        <w:spacing w:after="40" w:line="252" w:lineRule="auto"/>
-      </w:pPr>
-      <w:r>
-        <w:t>Engineered a reusable Apex REST framework for real-time cross-org data synchronization, sustaining 99.8% uptime over 24 months and 10,000 transactions/day across 3 Salesforce environments.</w:t>
-      </w:r>
-    </w:p>
-    <w:p>
-      <w:pPr>
-        <w:pStyle w:val="ListBullet"/>
-        <w:spacing w:after="40" w:line="252" w:lineRule="auto"/>
-      </w:pPr>
-      <w:r>
-        <w:t>Delivered 12+ LWC, Aura, Apex, Batch, and REST components at 90%+ test coverage, simplifying complex business processes and improving end-user experience.</w:t>
-      </w:r>
-    </w:p>
-    <w:p>
-      <w:pPr>
-        <w:pStyle w:val="ListBullet"/>
-        <w:spacing w:after="40" w:line="252" w:lineRule="auto"/>
-      </w:pPr>
-      <w:r>
-        <w:t>Led development of a Google Maps-integrated Lightning feature surfacing store locations, sales performance, and pricing — giving field teams real-time geographic visibility into client performance.</w:t>
-      </w:r>
-    </w:p>
-    <w:p>
-      <w:pPr>
-        <w:pStyle w:val="ListBullet"/>
-        <w:spacing w:after="40" w:line="252" w:lineRule="auto"/>
-      </w:pPr>
-      <w:r>
-        <w:t>Built automation frameworks with Batch Apex, Flows, and asynchronous processing, cutting manual processing effort by ~40% and improving operational throughput.</w:t>
-      </w:r>
-    </w:p>
-    <w:p>
-      <w:pPr>
-        <w:pStyle w:val="ListBullet"/>
-        <w:spacing w:after="40" w:line="252" w:lineRule="auto"/>
-      </w:pPr>
-      <w:r>
-        <w:t>Delivered 3 enterprise REST API integrations including a PCI-conscious payment gateway, enabling secure real-time transaction processing.</w:t>
-      </w:r>
-    </w:p>
-    <w:p>
-      <w:pPr>
-        <w:pStyle w:val="ListBullet"/>
-        <w:spacing w:after="40" w:line="252" w:lineRule="auto"/>
-      </w:pPr>
-      <w:r>
-        <w:t>Configured custom objects, junction objects, security models, sharing settings, and approval processes, and maintained CI/CD pipelines across multiple orgs using GitLab — improving data quality, governance, and release reliability.</w:t>
-      </w:r>
-    </w:p>
-    <w:p>
-      <w:pPr>
-        <w:tabs>
-          <w:tab w:pos="10080" w:val="right"/>
-        </w:tabs>
-        <w:spacing w:before="120" w:after="0"/>
-      </w:pPr>
-      <w:r>
-        <w:rPr>
-          <w:b/>
-          <w:color w:val="222222"/>
-          <w:sz w:val="22"/>
-        </w:rPr>
-        <w:t>Salesforce Developer, Wipro Ltd.</w:t>
-      </w:r>
-      <w:r>
-        <w:rPr>
-          <w:i/>
-          <w:sz w:val="19"/>
-        </w:rPr>
-        <w:tab/>
-        <w:t>Jun 2019 – Apr 2022</w:t>
-      </w:r>
-    </w:p>
-    <w:p>
-      <w:pPr>
-        <w:spacing w:after="40"/>
-      </w:pPr>
-      <w:r>
-        <w:rPr>
-          <w:i/>
-          <w:color w:val="555555"/>
-          <w:sz w:val="19"/>
-        </w:rPr>
-        <w:t>Bangalore, India</w:t>
-      </w:r>
-    </w:p>
-    <w:p>
-      <w:pPr>
-        <w:pStyle w:val="ListBullet"/>
-        <w:spacing w:after="40" w:line="252" w:lineRule="auto"/>
-      </w:pPr>
-      <w:r>
-        <w:t>Built an Order Management &amp; Discounting module in Sales Cloud for a pharmaceutical client, supporting order-processing workflows for 1,000+ sales users.</w:t>
-      </w:r>
-    </w:p>
-    <w:p>
-      <w:pPr>
-        <w:pStyle w:val="ListBullet"/>
-        <w:spacing w:after="40" w:line="252" w:lineRule="auto"/>
-      </w:pPr>
-      <w:r>
-        <w:t>Developed Salesforce solutions using Visualforce, Apex, Triggers, Workflow Rules, and Approval Processes, automating business processes and reducing manual effort by ~40%.</w:t>
-      </w:r>
-    </w:p>
-    <w:p>
-      <w:pPr>
-        <w:pStyle w:val="ListBullet"/>
-        <w:spacing w:after="40" w:line="252" w:lineRule="auto"/>
-      </w:pPr>
-      <w:r>
-        <w:t>Designed 20+ reports and 15+ interactive dashboards (Matrix, Joined, gauges, charts), giving stakeholders self-serve visibility into sales performance.</w:t>
-      </w:r>
-    </w:p>
-    <w:p>
-      <w:pPr>
-        <w:pStyle w:val="ListBullet"/>
-        <w:spacing w:after="40" w:line="252" w:lineRule="auto"/>
-      </w:pPr>
-      <w:r>
-        <w:t>Optimized application performance through governor-limit management and reusable, secure coding practices, and managed deployments via Workbench and ANT — achieving releases with zero critical deployment failures.</w:t>
-      </w:r>
-    </w:p>
-    <w:p>
-      <w:pPr>
-        <w:spacing w:before="160" w:after="40"/>
-        <w:pBdr>
-          <w:bottom w:val="single" w:sz="6" w:space="1" w:color="1F3A5F"/>
-        </w:pBdr>
-      </w:pPr>
-      <w:r>
-        <w:rPr>
-          <w:b/>
-          <w:color w:val="1F3A5F"/>
-          <w:sz w:val="23"/>
-        </w:rPr>
-        <w:t>EDUCATION</w:t>
-      </w:r>
-    </w:p>
-    <w:p>
-      <w:pPr>
-        <w:spacing w:after="40"/>
-      </w:pPr>
-      <w:r>
-        <w:rPr>
-          <w:b/>
+          <w:color w:val="204A87"/>
+          <w:sz w:val="21"/>
         </w:rPr>
         <w:t>B.Tech, Electronics &amp; Communication Engineering</w:t>
-      </w:r>
-      <w:r>
-        <w:t xml:space="preserve">  —  Institute of Engineering and Management, Kolkata  •  2019</w:t>
       </w:r>
     </w:p>
     <w:sectPr>
       <w:pgSz w:w="12240" w:h="15840"/>
-      <w:pgMar w:top="720" w:right="1080" w:bottom="720" w:left="1080" w:header="720" w:footer="720" w:gutter="0"/>
+      <w:pgMar w:top="680" w:right="1000" w:bottom="680" w:left="1000" w:header="720" w:footer="720" w:gutter="0"/>
       <w:cols w:space="720"/>
       <w:docGrid w:linePitch="360"/>
     </w:sectPr>
@@ -877,11 +947,11 @@
     <w:qFormat/>
     <w:rsid w:val="00FC693F"/>
     <w:pPr>
-      <w:spacing w:after="40" w:before="0" w:line="252" w:lineRule="auto"/>
+      <w:spacing w:after="40" w:before="0" w:line="250" w:lineRule="auto"/>
     </w:pPr>
     <w:rPr>
-      <w:rFonts w:ascii="Calibri" w:hAnsi="Calibri"/>
-      <w:color w:val="222222"/>
+      <w:rFonts w:ascii="Times New Roman" w:hAnsi="Times New Roman" w:cs="Times New Roman"/>
+      <w:color w:val="000000"/>
       <w:sz w:val="21"/>
     </w:rPr>
   </w:style>

</xml_diff>

<commit_message>
Match Google template: bold name, plain tech-stack bullets (no label)
</commit_message>
<xml_diff>
--- a/Sweta_Guha_Thakurta_Senior_Salesforce_Developer.docx
+++ b/Sweta_Guha_Thakurta_Senior_Salesforce_Developer.docx
@@ -9,7 +9,7 @@
       </w:pPr>
       <w:r>
         <w:rPr>
-          <w:b w:val="0"/>
+          <w:b/>
           <w:color w:val="000000"/>
           <w:sz w:val="48"/>
         </w:rPr>
@@ -258,14 +258,6 @@
       </w:pPr>
       <w:r>
         <w:rPr>
-          <w:b w:val="0"/>
-          <w:i/>
-          <w:sz w:val="21"/>
-        </w:rPr>
-        <w:t xml:space="preserve">Tools &amp; Tech: </w:t>
-      </w:r>
-      <w:r>
-        <w:rPr>
           <w:sz w:val="21"/>
         </w:rPr>
         <w:t>LWC, Apex, Triggers, Platform Events, Flows, Agentforce, Prompt Builder, VS Code, GitLab, DevOps Center, Azure DevOps, Postman</w:t>
@@ -375,14 +367,6 @@
       </w:pPr>
       <w:r>
         <w:rPr>
-          <w:b w:val="0"/>
-          <w:i/>
-          <w:sz w:val="21"/>
-        </w:rPr>
-        <w:t xml:space="preserve">Tools &amp; Tech: </w:t>
-      </w:r>
-      <w:r>
-        <w:rPr>
           <w:sz w:val="21"/>
         </w:rPr>
         <w:t>LWC, Aura, Apex, Batch Apex, REST APIs, Visualforce, GitLab, CI/CD, Postman</w:t>
@@ -478,14 +462,6 @@
         <w:pStyle w:val="ListBullet"/>
         <w:spacing w:after="30" w:line="250" w:lineRule="auto"/>
       </w:pPr>
-      <w:r>
-        <w:rPr>
-          <w:b w:val="0"/>
-          <w:i/>
-          <w:sz w:val="21"/>
-        </w:rPr>
-        <w:t xml:space="preserve">Tools &amp; Tech: </w:t>
-      </w:r>
       <w:r>
         <w:rPr>
           <w:sz w:val="21"/>

</xml_diff>

<commit_message>
Update skills section (add Java, Service Cloud, Force.com, Territory mgmt, Splunk, GitHub)
</commit_message>
<xml_diff>
--- a/Sweta_Guha_Thakurta_Senior_Salesforce_Developer.docx
+++ b/Sweta_Guha_Thakurta_Senior_Salesforce_Developer.docx
@@ -99,7 +99,7 @@
         <w:rPr>
           <w:sz w:val="21"/>
         </w:rPr>
-        <w:t>Apex, JavaScript (ES6+), SOQL, SOSL, Visualforce, HTML, CSS</w:t>
+        <w:t>Apex, Java, JavaScript (ES6+), SOQL, SOSL, Visualforce, HTML, CSS</w:t>
       </w:r>
     </w:p>
     <w:p>
@@ -117,7 +117,7 @@
         <w:rPr>
           <w:sz w:val="21"/>
         </w:rPr>
-        <w:t>Lightning Web Components (LWC), Aura, Flows, Triggers, Batch / Queueable / Scheduled Apex, Platform Events, Agentforce, Prompt Builder, Einstein AI, Sales Cloud, Experience Cloud, Commerce Cloud, CRM Analytics</w:t>
+        <w:t>Lightning Web Components (LWC), Aura, Flows, Triggers, Batch / Queueable / Scheduled Apex, Platform Events, Validation Rules, Approval Process, Territory Management, Agentforce, Prompt Builder, Einstein AI, CRM Analytics, Sales Cloud, Service Cloud, Experience Cloud, Commerce Cloud, Force.com</w:t>
       </w:r>
     </w:p>
     <w:p>
@@ -135,7 +135,7 @@
         <w:rPr>
           <w:sz w:val="21"/>
         </w:rPr>
-        <w:t>REST / SOAP APIs, Named Credentials, OAuth 2.0, MuleSoft, cross-org integration patterns, Salesforce DX, GitLab, Azure DevOps, DevOps Center, Copado, CI/CD, Data Loader, Workbench, Postman, Agile Scrum</w:t>
+        <w:t>REST / SOAP APIs, MuleSoft, Named Credentials, OAuth 2.0, Salesforce DX, GitHub, GitLab, Azure DevOps, DevOps Center, Copado, CI/CD, Data Loader, Workbench, ANT Migration Tool, Splunk, Postman, Agile Scrum</w:t>
       </w:r>
     </w:p>
     <w:p>

</xml_diff>

<commit_message>
Add Summary section; remove unsupported Java skill
</commit_message>
<xml_diff>
--- a/Sweta_Guha_Thakurta_Senior_Salesforce_Developer.docx
+++ b/Sweta_Guha_Thakurta_Senior_Salesforce_Developer.docx
@@ -81,6 +81,33 @@
           <w:color w:val="000000"/>
           <w:sz w:val="27"/>
         </w:rPr>
+        <w:t>Summary</w:t>
+      </w:r>
+    </w:p>
+    <w:p>
+      <w:pPr>
+        <w:spacing w:after="40"/>
+      </w:pPr>
+      <w:r>
+        <w:rPr>
+          <w:sz w:val="21"/>
+        </w:rPr>
+        <w:t>Senior Salesforce Developer with 7+ years delivering high-scale, customer-facing platforms and enterprise integrations across automotive, consulting, and pharma. Owns systems end-to-end - from a 10,000-user single sign-on portal to a 99.8%-uptime cross-org REST framework at 10,000 transactions/day - and pioneers AI features with Salesforce Agentforce and Prompt Builder. Trusted to turn ambiguous business needs into resilient, secure architecture while partnering across engineering, operations, and global stakeholders. 5x Salesforce certified.</w:t>
+      </w:r>
+    </w:p>
+    <w:p>
+      <w:pPr>
+        <w:spacing w:before="160" w:after="20"/>
+        <w:pBdr>
+          <w:bottom w:val="single" w:sz="6" w:space="2" w:color="000000"/>
+        </w:pBdr>
+      </w:pPr>
+      <w:r>
+        <w:rPr>
+          <w:b/>
+          <w:color w:val="000000"/>
+          <w:sz w:val="27"/>
+        </w:rPr>
         <w:t>Skills</w:t>
       </w:r>
     </w:p>
@@ -99,7 +126,7 @@
         <w:rPr>
           <w:sz w:val="21"/>
         </w:rPr>
-        <w:t>Apex, Java, JavaScript (ES6+), SOQL, SOSL, Visualforce, HTML, CSS</w:t>
+        <w:t>Apex, JavaScript (ES6+), SOQL, SOSL, Visualforce, HTML, CSS</w:t>
       </w:r>
     </w:p>
     <w:p>

</xml_diff>